<commit_message>
Resume: International KYC Associate @ Golden Opportunities (unknown)
</commit_message>
<xml_diff>
--- a/resumes/Resume_International_KYC_Associate_Golden_Opportunities__unknown_.docx
+++ b/resumes/Resume_International_KYC_Associate_Golden_Opportunities__unknown_.docx
@@ -413,7 +413,7 @@
           <w:sz w:val="19"/>
           <w:szCs w:val="19"/>
         </w:rPr>
-        <w:t>Triaged 50+ weekly inventory reimbursement cases by severity and policy eligibility, identifying high-risk claims for early investigation and resolution.</w:t>
+        <w:t>Triaged 50+ weekly inventory reimbursement cases by severity and policy eligibility, identifying high-priority issues for timely resolution and reducing repeat-issue investigation time.</w:t>
       </w:r>
     </w:p>
     <w:p>
@@ -432,7 +432,7 @@
           <w:sz w:val="19"/>
           <w:szCs w:val="19"/>
         </w:rPr>
-        <w:t>Investigated seller claims, conducting root cause analysis to identify policy violations and anomalous patterns, reducing repeat-issue investigation time.</w:t>
+        <w:t>Investigated seller claims, conducting root cause analysis to identify policy violations and anomalous patterns, resulting in 200+ weekly cases reviewed for potential fraud.</w:t>
       </w:r>
     </w:p>
     <w:p>
@@ -451,7 +451,7 @@
           <w:sz w:val="19"/>
           <w:szCs w:val="19"/>
         </w:rPr>
-        <w:t>Analyzed 200+ weekly cases to spot recurring fraud patterns, flagging them early to minimize investigation time and prevent financial losses.</w:t>
+        <w:t>Maintained audit-ready case documentation with findings, decisions, evidence notes, and corrective actions aligned to evidence documentation and decision trails.</w:t>
       </w:r>
     </w:p>
     <w:p>
@@ -470,7 +470,7 @@
           <w:sz w:val="19"/>
           <w:szCs w:val="19"/>
         </w:rPr>
-        <w:t>Documented investigation findings, decisions, evidence notes, and corrective actions in audit-ready case files, ensuring compliance and transparency in claims processing.</w:t>
+        <w:t>Documented investigation findings, decisions, evidence notes, and corrective actions in audit-ready case files, maintaining accurate and comprehensive records for senior reviewer review.</w:t>
       </w:r>
     </w:p>
     <w:p>
@@ -519,7 +519,7 @@
             <w:szCs w:val="19"/>
             <w:u w:val="single"/>
           </w:rPr>
-          <w:t>International KYC Associate Role Preparation</w:t>
+          <w:t>International KYC Associate</w:t>
         </w:r>
       </w:hyperlink>
       <w:r>
@@ -564,7 +564,7 @@
           <w:sz w:val="19"/>
           <w:szCs w:val="19"/>
         </w:rPr>
-        <w:t>Developed structured escalation workflow with severity-based prioritization and audit documentation. Deployed Splunk SIEM with SPL queries for brute-force detection, lateral movement, and privilege escalation (T1110, T1078, T1059).</w:t>
+        <w:t>Developed severity-based prioritization logic using structured escalation and pattern recognition. Deployed Splunk SIEM with SPL correlation searches for brute-force detection, lateral movement, and privilege escalation (T1110, T1078, T1059).</w:t>
       </w:r>
     </w:p>
     <w:p>
@@ -583,7 +583,7 @@
           <w:sz w:val="19"/>
           <w:szCs w:val="19"/>
         </w:rPr>
-        <w:t>Developed SOAR-style detection pipeline: Python script ingests Splunk alerts, enriches with VirusTotal API, and dispatches Telegram notifications with severity classification.</w:t>
+        <w:t>Built automated SOAR-style detection pipeline: ingests Splunk alerts, enriches with VirusTotal API, dispatches Telegram notifications with severity classification.</w:t>
       </w:r>
     </w:p>
     <w:p>
@@ -602,7 +602,7 @@
           <w:sz w:val="19"/>
           <w:szCs w:val="19"/>
         </w:rPr>
-        <w:t>Converted detection logic to Sigma rules; analyzed TCP/IP traffic in Wireshark for SYN scans, DNS tunnelling, and plaintext credential exposure; documented audit trail.</w:t>
+        <w:t>Converted detection logic to Sigma rules; analyzed TCP/IP traffic in Wireshark for SYN scans, DNS tunnelling, and plaintext credential exposure.</w:t>
       </w:r>
     </w:p>
     <w:p>
@@ -627,7 +627,7 @@
             <w:szCs w:val="19"/>
             <w:u w:val="single"/>
           </w:rPr>
-          <w:t>Vulnerability Scanner and Patch Prioritization Engine</w:t>
+          <w:t>International KYC Associate</w:t>
         </w:r>
       </w:hyperlink>
       <w:r>
@@ -672,7 +672,7 @@
           <w:sz w:val="19"/>
           <w:szCs w:val="19"/>
         </w:rPr>
-        <w:t>Developed automated vulnerability assessment pipeline integrating Nessus and OpenVAS REST APIs in Python, generating CVE reports with EPSS context from FIRST.org API and applying severity-based patch prioritization.</w:t>
+        <w:t>Developed automated vulnerability assessment pipeline integrating Nessus and OpenVAS REST APIs in Python, generating CVE reports with CVSS severity and EPSS context from FIRST.org API.</w:t>
       </w:r>
     </w:p>
     <w:p>
@@ -691,7 +691,7 @@
           <w:sz w:val="19"/>
           <w:szCs w:val="19"/>
         </w:rPr>
-        <w:t>Developed OWASP Top 10 automated web checker to detect injection, auth, and SSRF vulnerabilities; documented SQL injection remediation and exploitation patterns.</w:t>
+        <w:t>Developed OWASP Top 10 automated web checker to detect injection, auth, and SSRF vulnerabilities via crafted HTTP requests.</w:t>
       </w:r>
     </w:p>
     <w:p>
@@ -710,7 +710,7 @@
           <w:sz w:val="19"/>
           <w:szCs w:val="19"/>
         </w:rPr>
-        <w:t>Automated scan scheduling via Bash and cron; built delta-scan logic for CVE flagging and patch compliance tracking.</w:t>
+        <w:t>Automated scan scheduling via Bash and cron; built delta-scan logic to flag newly discovered CVEs and organize patch compliance (remediation tracking) tracking evidence.</w:t>
       </w:r>
     </w:p>
     <w:p>

</xml_diff>